<commit_message>
Support python-docx 0.8.11 and Python 3.10-3.15; simplify code
- Create numbering.xml when the template lacks it (python-docx raises
  NotImplementedError), and ignore style numbering that points at a
  missing w:num.
- Declare python-docx>=0.8.11, docutils>=0.18.1, Python>=3.10.
- Use f-strings, dataclasses and walrus where they read better;
  register_handler takes several node classes; split table layout out
  of the table handler; compute list numbering once per list.
- Read hyperlink text in tests independently of python-docx version.

Verified on Python 3.10-3.15 against python-docx 0.8.11 and 1.2.0.

Co-Authored-By: Claude Opus 5.5 <noreply@anthropic.com>
</commit_message>
<xml_diff>
--- a/examples/template.docx
+++ b/examples/template.docx
@@ -378,7 +378,7 @@
         <w:fldChar w:fldCharType="separate"/>
       </w:r>
       <w:r>
-        <w:t xml:space="preserve">Right-click and choose Update Field to build the table of contents.</w:t>
+        <w:t>Right-click and choose Update Field to build the table of contents.</w:t>
       </w:r>
       <w:r>
         <w:fldChar w:fldCharType="end"/>
@@ -427,7 +427,7 @@
       <w:fldChar w:fldCharType="separate"/>
     </w:r>
     <w:r>
-      <w:t xml:space="preserve">1</w:t>
+      <w:t>1</w:t>
     </w:r>
     <w:r>
       <w:fldChar w:fldCharType="end"/>

</xml_diff>

<commit_message>
Add lettered appendix sections
A new '.. appendix::' directive switches the sections after it to the
Appendix N styles, which the sample template letters A., A.1, A.1.1.

Co-Authored-By: Claude Opus 5.5 <noreply@anthropic.com>
</commit_message>
<xml_diff>
--- a/examples/template.docx
+++ b/examples/template.docx
@@ -50,6 +50,38 @@
       </w:pPr>
       <w:r>
         <w:t>Heading 4 sample</w:t>
+      </w:r>
+    </w:p>
+    <w:p>
+      <w:pPr>
+        <w:pStyle w:val="Appendix1"/>
+      </w:pPr>
+      <w:r>
+        <w:t>Appendix 1 sample</w:t>
+      </w:r>
+    </w:p>
+    <w:p>
+      <w:pPr>
+        <w:pStyle w:val="Appendix2"/>
+      </w:pPr>
+      <w:r>
+        <w:t>Appendix 2 sample</w:t>
+      </w:r>
+    </w:p>
+    <w:p>
+      <w:pPr>
+        <w:pStyle w:val="Appendix3"/>
+      </w:pPr>
+      <w:r>
+        <w:t>Appendix 3 sample</w:t>
+      </w:r>
+    </w:p>
+    <w:p>
+      <w:pPr>
+        <w:pStyle w:val="Appendix4"/>
+      </w:pPr>
+      <w:r>
+        <w:t>Appendix 4 sample</w:t>
       </w:r>
     </w:p>
     <w:p>
@@ -640,6 +672,49 @@
       </w:pPr>
     </w:lvl>
   </w:abstractNum>
+  <w:abstractNum w:abstractNumId="8">
+    <w:multiLevelType w:val="multilevel"/>
+    <w:lvl w:ilvl="0">
+      <w:start w:val="1"/>
+      <w:numFmt w:val="upperLetter"/>
+      <w:pStyle w:val="Appendix1"/>
+      <w:lvlText w:val="%1."/>
+      <w:lvlJc w:val="left"/>
+      <w:pPr>
+        <w:ind w:left="432" w:hanging="432"/>
+      </w:pPr>
+    </w:lvl>
+    <w:lvl w:ilvl="1">
+      <w:start w:val="1"/>
+      <w:numFmt w:val="decimal"/>
+      <w:pStyle w:val="Appendix2"/>
+      <w:lvlText w:val="%1.%2"/>
+      <w:lvlJc w:val="left"/>
+      <w:pPr>
+        <w:ind w:left="576" w:hanging="576"/>
+      </w:pPr>
+    </w:lvl>
+    <w:lvl w:ilvl="2">
+      <w:start w:val="1"/>
+      <w:numFmt w:val="decimal"/>
+      <w:pStyle w:val="Appendix3"/>
+      <w:lvlText w:val="%1.%2.%3"/>
+      <w:lvlJc w:val="left"/>
+      <w:pPr>
+        <w:ind w:left="720" w:hanging="720"/>
+      </w:pPr>
+    </w:lvl>
+    <w:lvl w:ilvl="3">
+      <w:start w:val="1"/>
+      <w:numFmt w:val="decimal"/>
+      <w:pStyle w:val="Appendix4"/>
+      <w:lvlText w:val="%1.%2.%3.%4"/>
+      <w:lvlJc w:val="left"/>
+      <w:pPr>
+        <w:ind w:left="864" w:hanging="864"/>
+      </w:pPr>
+    </w:lvl>
+  </w:abstractNum>
   <w:num w:numId="1">
     <w:abstractNumId w:val="1"/>
   </w:num>
@@ -660,6 +735,9 @@
   </w:num>
   <w:num w:numId="7">
     <w:abstractNumId w:val="7"/>
+  </w:num>
+  <w:num w:numId="8">
+    <w:abstractNumId w:val="8"/>
   </w:num>
 </w:numbering>
 </file>
@@ -934,6 +1012,54 @@
       <w:sz w:val="24"/>
       <w:szCs w:val="24"/>
     </w:rPr>
+  </w:style>
+  <w:style w:type="paragraph" w:styleId="Appendix1">
+    <w:name w:val="Appendix 1"/>
+    <w:basedOn w:val="Heading1"/>
+    <w:next w:val="Normal"/>
+    <w:qFormat/>
+    <w:pPr>
+      <w:numPr>
+        <w:ilvl w:val="0"/>
+        <w:numId w:val="8"/>
+      </w:numPr>
+    </w:pPr>
+  </w:style>
+  <w:style w:type="paragraph" w:styleId="Appendix2">
+    <w:name w:val="Appendix 2"/>
+    <w:basedOn w:val="Heading2"/>
+    <w:next w:val="Normal"/>
+    <w:qFormat/>
+    <w:pPr>
+      <w:numPr>
+        <w:ilvl w:val="1"/>
+        <w:numId w:val="8"/>
+      </w:numPr>
+    </w:pPr>
+  </w:style>
+  <w:style w:type="paragraph" w:styleId="Appendix3">
+    <w:name w:val="Appendix 3"/>
+    <w:basedOn w:val="Heading3"/>
+    <w:next w:val="Normal"/>
+    <w:qFormat/>
+    <w:pPr>
+      <w:numPr>
+        <w:ilvl w:val="2"/>
+        <w:numId w:val="8"/>
+      </w:numPr>
+    </w:pPr>
+  </w:style>
+  <w:style w:type="paragraph" w:styleId="Appendix4">
+    <w:name w:val="Appendix 4"/>
+    <w:basedOn w:val="Heading4"/>
+    <w:next w:val="Normal"/>
+    <w:qFormat/>
+    <w:pPr>
+      <w:numPr>
+        <w:ilvl w:val="3"/>
+        <w:numId w:val="8"/>
+      </w:numPr>
+    </w:pPr>
   </w:style>
   <w:style w:type="paragraph" w:styleId="Title">
     <w:name w:val="Title"/>

</xml_diff>

<commit_message>
Repeat template table rows for list variables
A table row containing {{list.*.field}} placeholders is repeated once per
item of the list, so tables outside the RST content can grow with the
data. The sample template uses it for a revision history and an approvals
table between the title page and the table of contents.

Co-Authored-By: Claude Opus 5.5 <noreply@anthropic.com>
</commit_message>
<xml_diff>
--- a/examples/template.docx
+++ b/examples/template.docx
@@ -404,6 +404,247 @@
             <w:r>
               <w:t>{{doc.author}}</w:t>
             </w:r>
+          </w:p>
+        </w:tc>
+      </w:tr>
+    </w:tbl>
+    <w:p>
+      <w:r>
+        <w:br w:type="page"/>
+      </w:r>
+    </w:p>
+    <w:p>
+      <w:pPr>
+        <w:pStyle w:val="TOCHeading"/>
+      </w:pPr>
+      <w:r>
+        <w:t>Revision History</w:t>
+      </w:r>
+    </w:p>
+    <w:tbl>
+      <w:tblPr>
+        <w:tblStyle w:val="TableGrid"/>
+        <w:tblW w:type="auto" w:w="0"/>
+        <w:tblLayout w:type="fixed"/>
+        <w:tblLook w:firstColumn="1" w:firstRow="1" w:lastColumn="0" w:lastRow="0" w:noHBand="0" w:noVBand="1" w:val="04A0"/>
+      </w:tblPr>
+      <w:tblGrid>
+        <w:gridCol w:w="864"/>
+        <w:gridCol w:w="1584"/>
+        <w:gridCol w:w="4896"/>
+        <w:gridCol w:w="2016"/>
+      </w:tblGrid>
+      <w:tr>
+        <w:tc>
+          <w:tcPr>
+            <w:tcW w:type="dxa" w:w="864"/>
+          </w:tcPr>
+          <w:p>
+            <w:r>
+              <w:rPr>
+                <w:b/>
+              </w:rPr>
+              <w:t>Rev</w:t>
+            </w:r>
+          </w:p>
+        </w:tc>
+        <w:tc>
+          <w:tcPr>
+            <w:tcW w:type="dxa" w:w="1584"/>
+          </w:tcPr>
+          <w:p>
+            <w:r>
+              <w:rPr>
+                <w:b/>
+              </w:rPr>
+              <w:t>Date</w:t>
+            </w:r>
+          </w:p>
+        </w:tc>
+        <w:tc>
+          <w:tcPr>
+            <w:tcW w:type="dxa" w:w="4896"/>
+          </w:tcPr>
+          <w:p>
+            <w:r>
+              <w:rPr>
+                <w:b/>
+              </w:rPr>
+              <w:t>Description</w:t>
+            </w:r>
+          </w:p>
+        </w:tc>
+        <w:tc>
+          <w:tcPr>
+            <w:tcW w:type="dxa" w:w="2016"/>
+          </w:tcPr>
+          <w:p>
+            <w:r>
+              <w:rPr>
+                <w:b/>
+              </w:rPr>
+              <w:t>Author</w:t>
+            </w:r>
+          </w:p>
+        </w:tc>
+      </w:tr>
+      <w:tr>
+        <w:tc>
+          <w:tcPr>
+            <w:tcW w:type="dxa" w:w="864"/>
+          </w:tcPr>
+          <w:p>
+            <w:r>
+              <w:t>{{revisions.*.rev}}</w:t>
+            </w:r>
+          </w:p>
+        </w:tc>
+        <w:tc>
+          <w:tcPr>
+            <w:tcW w:type="dxa" w:w="1584"/>
+          </w:tcPr>
+          <w:p>
+            <w:r>
+              <w:t>{{revisions.*.date}}</w:t>
+            </w:r>
+          </w:p>
+        </w:tc>
+        <w:tc>
+          <w:tcPr>
+            <w:tcW w:type="dxa" w:w="4896"/>
+          </w:tcPr>
+          <w:p>
+            <w:r>
+              <w:t>{{revisions.*.description}}</w:t>
+            </w:r>
+          </w:p>
+        </w:tc>
+        <w:tc>
+          <w:tcPr>
+            <w:tcW w:type="dxa" w:w="2016"/>
+          </w:tcPr>
+          <w:p>
+            <w:r>
+              <w:t>{{revisions.*.author}}</w:t>
+            </w:r>
+          </w:p>
+        </w:tc>
+      </w:tr>
+    </w:tbl>
+    <w:p/>
+    <w:p>
+      <w:pPr>
+        <w:pStyle w:val="TOCHeading"/>
+      </w:pPr>
+      <w:r>
+        <w:t>Approvals</w:t>
+      </w:r>
+    </w:p>
+    <w:tbl>
+      <w:tblPr>
+        <w:tblStyle w:val="TableGrid"/>
+        <w:tblW w:type="auto" w:w="0"/>
+        <w:tblLayout w:type="fixed"/>
+        <w:tblLook w:firstColumn="1" w:firstRow="1" w:lastColumn="0" w:lastRow="0" w:noHBand="0" w:noVBand="1" w:val="04A0"/>
+      </w:tblPr>
+      <w:tblGrid>
+        <w:gridCol w:w="2304"/>
+        <w:gridCol w:w="2592"/>
+        <w:gridCol w:w="2880"/>
+        <w:gridCol w:w="1584"/>
+      </w:tblGrid>
+      <w:tr>
+        <w:tc>
+          <w:tcPr>
+            <w:tcW w:type="dxa" w:w="2304"/>
+          </w:tcPr>
+          <w:p>
+            <w:r>
+              <w:rPr>
+                <w:b/>
+              </w:rPr>
+              <w:t>Role</w:t>
+            </w:r>
+          </w:p>
+        </w:tc>
+        <w:tc>
+          <w:tcPr>
+            <w:tcW w:type="dxa" w:w="2592"/>
+          </w:tcPr>
+          <w:p>
+            <w:r>
+              <w:rPr>
+                <w:b/>
+              </w:rPr>
+              <w:t>Name</w:t>
+            </w:r>
+          </w:p>
+        </w:tc>
+        <w:tc>
+          <w:tcPr>
+            <w:tcW w:type="dxa" w:w="2880"/>
+          </w:tcPr>
+          <w:p>
+            <w:r>
+              <w:rPr>
+                <w:b/>
+              </w:rPr>
+              <w:t>Signature</w:t>
+            </w:r>
+          </w:p>
+        </w:tc>
+        <w:tc>
+          <w:tcPr>
+            <w:tcW w:type="dxa" w:w="1584"/>
+          </w:tcPr>
+          <w:p>
+            <w:r>
+              <w:rPr>
+                <w:b/>
+              </w:rPr>
+              <w:t>Date</w:t>
+            </w:r>
+          </w:p>
+        </w:tc>
+      </w:tr>
+      <w:tr>
+        <w:trPr>
+          <w:trHeight w:val="600"/>
+        </w:trPr>
+        <w:tc>
+          <w:tcPr>
+            <w:tcW w:type="dxa" w:w="2304"/>
+          </w:tcPr>
+          <w:p>
+            <w:r>
+              <w:t>{{signatures.*.role}}</w:t>
+            </w:r>
+          </w:p>
+        </w:tc>
+        <w:tc>
+          <w:tcPr>
+            <w:tcW w:type="dxa" w:w="2592"/>
+          </w:tcPr>
+          <w:p>
+            <w:r>
+              <w:t>{{signatures.*.name}}</w:t>
+            </w:r>
+          </w:p>
+        </w:tc>
+        <w:tc>
+          <w:tcPr>
+            <w:tcW w:type="dxa" w:w="2880"/>
+          </w:tcPr>
+          <w:p>
+            <w:r/>
+          </w:p>
+        </w:tc>
+        <w:tc>
+          <w:tcPr>
+            <w:tcW w:type="dxa" w:w="1584"/>
+          </w:tcPr>
+          <w:p>
+            <w:r/>
           </w:p>
         </w:tc>
       </w:tr>

</xml_diff>